<commit_message>
Keep the Word install guide and launchers aligned with 1405.6.2α.
Add the 1KB-is-not-the-app warning the shop tests require, stamp
OPEN_SIRMAN.bat and sirman_run.ps1, and keep the Tehran same-day
task fixture from flipping at midnight.

Co-authored-by: estelami1366-ux <estelami1366-ux@users.noreply.github.com>
</commit_message>
<xml_diff>
--- a/deliveries/Reports/راهنمای_نصب_و_آپدیت.docx
+++ b/deliveries/Reports/راهنمای_نصب_و_آپدیت.docx
@@ -201,6 +201,23 @@
           <w:cs/>
         </w:rPr>
         <w:t>فایل گزارش .md</w:t>
+      </w:r>
+    </w:p>
+    <w:p>
+      <w:pPr>
+        <w:bidi w:val="1"/>
+        <w:jc w:val="right"/>
+      </w:pPr>
+      <w:r>
+        <w:rPr>
+          <w:rFonts w:ascii="Tahoma" w:hAnsi="Tahoma" w:cs="Tahoma" w:eastAsia="Tahoma"/>
+          <w:b/>
+          <w:color w:val="B45309"/>
+          <w:sz w:val="24"/>
+          <w:rtl w:val="1"/>
+          <w:cs/>
+        </w:rPr>
+        <w:t>فایل یک‌کیلوبایتی برنامه نیست.</w:t>
       </w:r>
     </w:p>
     <w:p>

</xml_diff>

<commit_message>
pack: complete self-contained shop kit 1405.6.3α
Stamp today's Jalali version and ship one install zip with native invoice,
test-page, postal-label print, disk media storage, Word guide, and the .NET
runtime inside App. Live data remains localStorage; SQLite is still candidate.

Co-authored-by: estelami1366-ux <estelami1366-ux@users.noreply.github.com>
</commit_message>
<xml_diff>
--- a/deliveries/Reports/راهنمای_نصب_و_آپدیت.docx
+++ b/deliveries/Reports/راهنمای_نصب_و_آپدیت.docx
@@ -48,7 +48,7 @@
           <w:rtl w:val="1"/>
           <w:cs/>
         </w:rPr>
-        <w:t>نسخه نرم‌افزار: ۱۴۰۵.۶.۲α   (1405.6.2α)</w:t>
+        <w:t>نسخه نرم‌افزار: ۱۴۰۵.۶.۳α   (1405.6.3α)</w:t>
       </w:r>
     </w:p>
     <w:p>
@@ -64,7 +64,7 @@
           <w:rtl w:val="1"/>
           <w:cs/>
         </w:rPr>
-        <w:t>تاریخ: ۱۴۰۵/۰۶/۰۲</w:t>
+        <w:t>تاریخ: ۱۴۰۵/۰۶/۰۳</w:t>
       </w:r>
     </w:p>
     <w:p>
@@ -113,7 +113,7 @@
           <w:rtl w:val="1"/>
           <w:cs/>
         </w:rPr>
-        <w:t>فایل نصب فروشگاه:  Sirman_Setup_1405.6.2α.zip</w:t>
+        <w:t>فایل نصب فروشگاه:  Sirman_Setup_1405.6.3α.zip</w:t>
       </w:r>
     </w:p>
     <w:p>
@@ -335,7 +335,7 @@
           <w:rtl w:val="1"/>
           <w:cs/>
         </w:rPr>
-        <w:t>.NET 8 Desktop Runtime x64 از صفحه دانلود دات‌نت ۸ — همان صفحه: Desktop Runtime 8، Windows x64</w:t>
+        <w:t>این کیت خودکفا است؛ Runtime دات‌نت داخل پوشه App است و لازم نیست جداگانه نصب شود</w:t>
       </w:r>
     </w:p>
     <w:p>
@@ -418,7 +418,7 @@
           <w:rtl w:val="1"/>
           <w:cs/>
         </w:rPr>
-        <w:t>فایل Sirman_Setup_1405.6.2α.zip را روی هارد فروشگاه کپی کنید. از روی فلش قفل‌شده اجرا نکنید.</w:t>
+        <w:t>فایل Sirman_Setup_1405.6.3α.zip را روی هارد فروشگاه کپی کنید. از روی فلش قفل‌شده اجرا نکنید.</w:t>
       </w:r>
     </w:p>
     <w:p>
@@ -616,7 +616,7 @@
           <w:rtl w:val="1"/>
           <w:cs/>
         </w:rPr>
-        <w:t>پایین سایدبار سمت راست نسخه باید ۱۴۰۵.۶.۲α باشد. تمام.</w:t>
+        <w:t>پایین سایدبار سمت راست نسخه باید ۱۴۰۵.۶.۳α باشد. تمام.</w:t>
       </w:r>
     </w:p>
     <w:p>
@@ -634,23 +634,6 @@
           <w:cs/>
         </w:rPr>
         <w:t>۴) اگر Sirman.exe باز نشد</w:t>
-      </w:r>
-    </w:p>
-    <w:p>
-      <w:pPr>
-        <w:pStyle w:val="ListBullet"/>
-        <w:bidi w:val="1"/>
-        <w:jc w:val="right"/>
-      </w:pPr>
-      <w:r>
-        <w:rPr>
-          <w:rFonts w:ascii="Tahoma" w:hAnsi="Tahoma" w:cs="Tahoma" w:eastAsia="Tahoma"/>
-          <w:b w:val="0"/>
-          <w:sz w:val="24"/>
-          <w:rtl w:val="1"/>
-          <w:cs/>
-        </w:rPr>
-        <w:t>پیام نبودن .NET: Desktop Runtime 8 ویندوز x64 را نصب کنید، Restart، دوباره باز کنید.</w:t>
       </w:r>
     </w:p>
     <w:p>
@@ -854,7 +837,7 @@
           <w:rtl w:val="1"/>
           <w:cs/>
         </w:rPr>
-        <w:t>بعد از باز کردن، نسخه باید ۱۴۰۵.۶.۲α باشد و فاکتور قبلی سر جایش.</w:t>
+        <w:t>بعد از باز کردن، نسخه باید ۱۴۰۵.۶.۳α باشد و فاکتور قبلی سر جایش.</w:t>
       </w:r>
     </w:p>
     <w:p>
@@ -956,7 +939,7 @@
           <w:rtl w:val="1"/>
           <w:cs/>
         </w:rPr>
-        <w:t>پایین سایدبار نسخه ۱۴۰۵.۶.۲α است.</w:t>
+        <w:t>پایین سایدبار نسخه ۱۴۰۵.۶.۳α است.</w:t>
       </w:r>
     </w:p>
     <w:p>

</xml_diff>